<commit_message>
Ouvidoria- documento exportado melhorado
</commit_message>
<xml_diff>
--- a/GsdAutomatico/pdf/PATD_Coringa.docx
+++ b/GsdAutomatico/pdf/PATD_Coringa.docx
@@ -1840,6 +1840,7 @@
           <w:b w:val="0"/>
           <w:bCs w:val="0"/>
           <w:color w:val="ff0000"/>
+          <w:highlight w:val="none"/>
         </w:rPr>
       </w:r>
       <w:r>
@@ -1947,7 +1948,6 @@
           <w:b w:val="0"/>
           <w:bCs w:val="0"/>
           <w:color w:val="ff0000"/>
-          <w:highlight w:val="none"/>
         </w:rPr>
       </w:r>
       <w:r>
@@ -4791,81 +4791,6 @@
           <w:sz w:val="24"/>
           <w:szCs w:val="24"/>
         </w:rPr>
-        <mc:AlternateContent>
-          <mc:Choice Requires="wpg">
-            <w:drawing>
-              <wp:anchor xmlns:wp="http://schemas.openxmlformats.org/drawingml/2006/wordprocessingDrawing" xmlns:wp14="http://schemas.microsoft.com/office/word/2010/wordprocessingDrawing" distT="0" distB="0" distL="0" distR="0" simplePos="0" relativeHeight="9" behindDoc="1" locked="0" layoutInCell="1" allowOverlap="1">
-                <wp:simplePos x="0" y="0"/>
-                <wp:positionH relativeFrom="column">
-                  <wp:posOffset>2810510</wp:posOffset>
-                </wp:positionH>
-                <wp:positionV relativeFrom="paragraph">
-                  <wp:posOffset>105410</wp:posOffset>
-                </wp:positionV>
-                <wp:extent cx="560705" cy="589280"/>
-                <wp:effectExtent l="0" t="0" r="0" b="0"/>
-                <wp:wrapNone/>
-                <wp:docPr id="8" name="Picture 15" descr=""/>
-                <wp:cNvGraphicFramePr>
-                  <a:graphicFrameLocks xmlns:a="http://schemas.openxmlformats.org/drawingml/2006/main" noChangeAspect="1"/>
-                </wp:cNvGraphicFramePr>
-                <a:graphic xmlns:a="http://schemas.openxmlformats.org/drawingml/2006/main">
-                  <a:graphicData uri="http://schemas.openxmlformats.org/drawingml/2006/picture">
-                    <pic:pic xmlns:pic="http://schemas.openxmlformats.org/drawingml/2006/picture">
-                      <pic:nvPicPr>
-                        <pic:cNvPr id="8" name="Picture 15" descr=""/>
-                        <pic:cNvPicPr>
-                          <a:picLocks noChangeAspect="1"/>
-                        </pic:cNvPicPr>
-                        <pic:nvPr/>
-                      </pic:nvPicPr>
-                      <pic:blipFill rotWithShape="1">
-                        <a:blip r:embed="rId21"/>
-                        <a:stretch/>
-                      </pic:blipFill>
-                      <pic:spPr bwMode="auto">
-                        <a:xfrm>
-                          <a:off x="0" y="0"/>
-                          <a:ext cx="560705" cy="589280"/>
-                        </a:xfrm>
-                        <a:prstGeom prst="rect">
-                          <a:avLst/>
-                        </a:prstGeom>
-                      </pic:spPr>
-                    </pic:pic>
-                  </a:graphicData>
-                </a:graphic>
-              </wp:anchor>
-            </w:drawing>
-          </mc:Choice>
-          <mc:Fallback>
-            <w:pict>
-              <v:shapetype id="_x0000_t75" coordsize="21600,21600" o:spt="75" o:preferrelative="t" path="m@4@5l@4@11@9@11@9@5xe" filled="f" stroked="f">
-                <v:stroke joinstyle="miter"/>
-                <v:formulas>
-                  <v:f eqn="if lineDrawn pixelLineWidth 0"/>
-                  <v:f eqn="sum @0 1 0"/>
-                  <v:f eqn="sum 0 0 @1"/>
-                  <v:f eqn="prod @2 1 2"/>
-                  <v:f eqn="prod @3 21600 pixelWidth"/>
-                  <v:f eqn="prod @3 21600 pixelHeight"/>
-                  <v:f eqn="sum @0 0 1"/>
-                  <v:f eqn="prod @6 1 2"/>
-                  <v:f eqn="prod @7 21600 pixelWidth"/>
-                  <v:f eqn="sum @8 21600 0"/>
-                  <v:f eqn="prod @7 21600 pixelHeight"/>
-                  <v:f eqn="sum @10 21600 0"/>
-                </v:formulas>
-                <v:path o:extrusionok="f" gradientshapeok="t" o:connecttype="rect"/>
-                <o:lock v:ext="edit" aspectratio="t"/>
-              </v:shapetype>
-              <v:shape id="_x0000_i7" o:spid="_x0000_s7" type="#_x0000_t75" style="position:absolute;z-index:-9;o:allowoverlap:true;o:allowincell:true;mso-position-horizontal-relative:text;margin-left:221.30pt;mso-position-horizontal:absolute;mso-position-vertical-relative:text;margin-top:8.30pt;mso-position-vertical:absolute;width:44.15pt;height:46.40pt;mso-wrap-distance-left:0.00pt;mso-wrap-distance-top:0.00pt;mso-wrap-distance-right:0.00pt;mso-wrap-distance-bottom:0.00pt;z-index:1;" stroked="false">
-                <v:imagedata r:id="rId21" o:title=""/>
-                <o:lock v:ext="edit" rotation="t"/>
-              </v:shape>
-            </w:pict>
-          </mc:Fallback>
-        </mc:AlternateContent>
       </w:r>
       <w:r>
         <w:rPr>
@@ -5499,6 +5424,7 @@
           <w:bCs/>
           <w:color w:val="ff0000"/>
         </w:rPr>
+        <w:t xml:space="preserve">:</w:t>
       </w:r>
       <w:r>
         <w:rPr>
@@ -5506,13 +5432,13 @@
           <w:bCs/>
           <w:color w:val="ff0000"/>
         </w:rPr>
-        <w:t xml:space="preserve">:</w:t>
       </w:r>
       <w:r>
         <w:rPr>
           <w:b/>
           <w:bCs/>
           <w:color w:val="ff0000"/>
+          <w:highlight w:val="none"/>
         </w:rPr>
       </w:r>
     </w:p>
@@ -5554,7 +5480,6 @@
           <w:b/>
           <w:bCs/>
           <w:color w:val="ff0000"/>
-          <w:highlight w:val="none"/>
         </w:rPr>
       </w:r>
     </w:p>
@@ -5596,6 +5521,7 @@
           <w:b w:val="0"/>
           <w:bCs w:val="0"/>
           <w:color w:val="ff0000"/>
+          <w:highlight w:val="none"/>
         </w:rPr>
       </w:r>
     </w:p>
@@ -5637,7 +5563,6 @@
           <w:b w:val="0"/>
           <w:bCs w:val="0"/>
           <w:color w:val="ff0000"/>
-          <w:highlight w:val="none"/>
         </w:rPr>
       </w:r>
     </w:p>
@@ -5866,6 +5791,12 @@
           <w:color w:val="ff0000"/>
         </w:rPr>
       </w:r>
+      <w:r>
+        <w:rPr>
+          <w:color w:val="ff0000"/>
+          <w:highlight w:val="none"/>
+        </w:rPr>
+      </w:r>
     </w:p>
     <w:p>
       <w:pPr>
@@ -5897,7 +5828,6 @@
       <w:r>
         <w:rPr>
           <w:color w:val="ff0000"/>
-          <w:highlight w:val="none"/>
         </w:rPr>
       </w:r>
     </w:p>
@@ -6139,71 +6069,7 @@
         <w:pBdr/>
         <w:spacing w:line="163" w:lineRule="exact"/>
         <w:ind/>
-        <w:rPr>
-          <w:b/>
-          <w:bCs/>
-        </w:rPr>
-      </w:pPr>
-      <w:r>
-        <w:rPr>
-          <w:b/>
-          <w:bCs/>
-        </w:rPr>
-      </w:r>
-      <w:r>
-        <w:rPr>
-          <w:b/>
-          <w:bCs/>
-        </w:rPr>
-      </w:r>
-      <w:r>
-        <w:rPr>
-          <w:b/>
-          <w:bCs/>
-        </w:rPr>
-      </w:r>
-    </w:p>
-    <w:p>
-      <w:pPr>
-        <w:pStyle w:val="1117"/>
-        <w:pBdr/>
-        <w:spacing w:line="163" w:lineRule="exact"/>
-        <w:ind/>
-        <w:rPr>
-          <w:rFonts w:eastAsia="Times New Roman"/>
-          <w:sz w:val="24"/>
-          <w:szCs w:val="24"/>
-        </w:rPr>
-      </w:pPr>
-      <w:r>
-        <w:rPr>
-          <w:rFonts w:eastAsia="Times New Roman"/>
-          <w:sz w:val="24"/>
-          <w:szCs w:val="24"/>
-        </w:rPr>
-      </w:r>
-      <w:r>
-        <w:rPr>
-          <w:rFonts w:eastAsia="Times New Roman"/>
-          <w:sz w:val="24"/>
-          <w:szCs w:val="24"/>
-        </w:rPr>
-      </w:r>
-      <w:r>
-        <w:rPr>
-          <w:rFonts w:eastAsia="Times New Roman"/>
-          <w:sz w:val="24"/>
-          <w:szCs w:val="24"/>
-        </w:rPr>
-      </w:r>
-    </w:p>
-    <w:p>
-      <w:pPr>
-        <w:pStyle w:val="1117"/>
-        <w:pBdr/>
-        <w:spacing w:line="163" w:lineRule="exact"/>
-        <w:ind/>
-        <w:jc w:val="center"/>
+        <w:jc w:val="left"/>
         <w:rPr>
           <w:b/>
           <w:bCs/>
@@ -6907,7 +6773,7 @@
         <w:pBdr/>
         <w:spacing/>
         <w:ind/>
-        <w:jc w:val="center"/>
+        <w:jc w:val="left"/>
         <w:rPr>
           <w:rFonts w:eastAsia="Times New Roman"/>
           <w:color w:val="1c1c1c"/>
@@ -6915,14 +6781,6 @@
           <w:szCs w:val="24"/>
         </w:rPr>
       </w:pPr>
-      <w:r>
-        <w:rPr>
-          <w:rFonts w:eastAsia="Times New Roman"/>
-          <w:color w:val="1c1c1c"/>
-          <w:sz w:val="24"/>
-          <w:szCs w:val="24"/>
-        </w:rPr>
-      </w:r>
       <w:r>
         <w:rPr>
           <w:rFonts w:eastAsia="Times New Roman"/>
@@ -6970,31 +6828,7 @@
           <w:sz w:val="24"/>
           <w:szCs w:val="24"/>
         </w:rPr>
-        <w:t xml:space="preserve">                                                                               </w:t>
-      </w:r>
-      <w:r>
-        <w:rPr>
-          <w:rFonts w:eastAsia="Times New Roman"/>
-          <w:b/>
-          <w:bCs/>
-          <w:color w:val="000000" w:themeColor="text1"/>
-          <w:sz w:val="24"/>
-          <w:szCs w:val="24"/>
-          <w:lang w:val="en-US"/>
-        </w:rPr>
-        <w:t xml:space="preserve">PATD Nº</w:t>
-      </w:r>
-      <w:r>
-        <w:rPr>
-          <w:rFonts w:eastAsia="Times New Roman"/>
-          <w:b/>
-          <w:bCs/>
-          <w:color w:val="ff0000"/>
-          <w:sz w:val="24"/>
-          <w:szCs w:val="24"/>
-          <w:lang w:val="en-US"/>
-        </w:rPr>
-        <w:t xml:space="preserve"> {N PATD}</w:t>
+        <w:t xml:space="preserve">                                                                        </w:t>
       </w:r>
       <w:r>
         <w:rPr>
@@ -7004,7 +6838,6 @@
           <w:color w:val="ff0000"/>
           <w:lang w:val="en-US"/>
         </w:rPr>
-        <w:t xml:space="preserve">/BAGL-GSDGL/{DataPatd}</w:t>
       </w:r>
       <w:r>
         <w:rPr>
@@ -7015,7 +6848,14 @@
           <w:lang w:val="en-US"/>
         </w:rPr>
       </w:r>
-      <w:r>
+    </w:p>
+    <w:p>
+      <w:pPr>
+        <w:pStyle w:val="1117"/>
+        <w:pBdr/>
+        <w:spacing w:after="200" w:before="0" w:line="276" w:lineRule="auto"/>
+        <w:ind/>
+        <w:jc w:val="right"/>
         <w:rPr>
           <w:rFonts w:eastAsia="Times New Roman"/>
           <w:b/>
@@ -7023,14 +6863,8 @@
           <w:color w:val="ff0000"/>
           <w:lang w:val="en-US"/>
         </w:rPr>
-      </w:r>
-    </w:p>
-    <w:p>
-      <w:pPr>
-        <w:pStyle w:val="1117"/>
-        <w:pBdr/>
-        <w:spacing w:after="200" w:before="0" w:line="276" w:lineRule="auto"/>
-        <w:ind/>
+      </w:pPr>
+      <w:r>
         <w:rPr>
           <w:rFonts w:eastAsia="Times New Roman"/>
           <w:b/>
@@ -7038,7 +6872,7 @@
           <w:color w:val="ff0000"/>
           <w:lang w:val="en-US"/>
         </w:rPr>
-      </w:pPr>
+      </w:r>
       <w:r>
         <w:rPr>
           <w:rFonts w:eastAsia="Times New Roman"/>
@@ -7051,11 +6885,34 @@
       <w:r>
         <w:rPr>
           <w:rFonts w:eastAsia="Times New Roman"/>
+          <w:sz w:val="24"/>
+          <w:szCs w:val="24"/>
+        </w:rPr>
+        <w:t xml:space="preserve">     </w:t>
+      </w:r>
+      <w:r>
+        <w:rPr>
+          <w:rFonts w:eastAsia="Times New Roman"/>
+          <w:b/>
+          <w:bCs/>
+          <w:color w:val="000000" w:themeColor="text1"/>
+          <w:sz w:val="24"/>
+          <w:szCs w:val="24"/>
+          <w:lang w:val="en-US"/>
+        </w:rPr>
+        <w:t xml:space="preserve">PATD Nº</w:t>
+      </w:r>
+      <w:r>
+        <w:rPr>
+          <w:rFonts w:eastAsia="Times New Roman"/>
           <w:b/>
           <w:bCs/>
           <w:color w:val="ff0000"/>
+          <w:sz w:val="24"/>
+          <w:szCs w:val="24"/>
           <w:lang w:val="en-US"/>
         </w:rPr>
+        <w:t xml:space="preserve"> {N PATD}</w:t>
       </w:r>
       <w:r>
         <w:rPr>
@@ -7065,14 +6922,10 @@
           <w:color w:val="ff0000"/>
           <w:lang w:val="en-US"/>
         </w:rPr>
-      </w:r>
-    </w:p>
-    <w:p>
-      <w:pPr>
-        <w:pStyle w:val="1117"/>
-        <w:pBdr/>
-        <w:spacing w:after="200" w:before="0" w:line="276" w:lineRule="auto"/>
-        <w:ind/>
+        <w:t xml:space="preserve">/BAGL-GSDGL/{DataPatd}</w:t>
+      </w:r>
+      <w:r/>
+      <w:r>
         <w:rPr>
           <w:rFonts w:eastAsia="Times New Roman"/>
           <w:b/>
@@ -7080,7 +6933,7 @@
           <w:color w:val="ff0000"/>
           <w:lang w:val="en-US"/>
         </w:rPr>
-      </w:pPr>
+      </w:r>
       <w:r>
         <w:rPr>
           <w:rFonts w:eastAsia="Times New Roman"/>
@@ -7090,7 +6943,13 @@
           <w:lang w:val="en-US"/>
         </w:rPr>
       </w:r>
-      <w:r>
+    </w:p>
+    <w:p>
+      <w:pPr>
+        <w:pStyle w:val="1117"/>
+        <w:pBdr/>
+        <w:spacing w:after="200" w:before="0" w:line="276" w:lineRule="auto"/>
+        <w:ind/>
         <w:rPr>
           <w:rFonts w:eastAsia="Times New Roman"/>
           <w:b/>
@@ -7098,7 +6957,7 @@
           <w:color w:val="ff0000"/>
           <w:lang w:val="en-US"/>
         </w:rPr>
-      </w:r>
+      </w:pPr>
       <w:r>
         <w:rPr>
           <w:rFonts w:eastAsia="Times New Roman"/>
@@ -7108,115 +6967,132 @@
           <w:lang w:val="en-US"/>
         </w:rPr>
       </w:r>
-    </w:p>
-    <w:p>
-      <w:pPr>
-        <w:pStyle w:val="1117"/>
-        <w:pBdr/>
-        <w:spacing w:after="200" w:before="0" w:line="276" w:lineRule="auto"/>
-        <w:ind/>
-        <w:jc w:val="center"/>
-        <w:rPr>
-          <w:rFonts w:eastAsia="Times New Roman"/>
-          <w:b/>
-          <w:bCs/>
-          <w:color w:val="ff0000"/>
-          <w:sz w:val="24"/>
-          <w:szCs w:val="24"/>
-        </w:rPr>
-      </w:pPr>
-      <w:r>
-        <w:rPr>
-          <w:rFonts w:eastAsia="Times New Roman"/>
-          <w:b/>
-          <w:bCs/>
-          <w:color w:val="ff0000"/>
-          <w:sz w:val="24"/>
-          <w:szCs w:val="24"/>
-        </w:rPr>
-        <w:t xml:space="preserve">{nova_pagina}</w:t>
-      </w:r>
-      <w:r>
-        <w:rPr>
-          <w:rFonts w:eastAsia="Times New Roman"/>
-          <w:b/>
-          <w:bCs/>
-          <w:color w:val="ff0000"/>
-          <w:sz w:val="24"/>
-          <w:szCs w:val="24"/>
-        </w:rPr>
-      </w:r>
-      <w:r>
-        <w:rPr>
-          <w:rFonts w:eastAsia="Times New Roman"/>
-          <w:b/>
-          <w:bCs/>
-          <w:color w:val="ff0000"/>
-          <w:sz w:val="24"/>
-          <w:szCs w:val="24"/>
-        </w:rPr>
-      </w:r>
-    </w:p>
-    <w:p>
-      <w:pPr>
-        <w:pStyle w:val="1117"/>
-        <w:pBdr/>
-        <w:spacing w:after="200" w:before="0" w:line="276" w:lineRule="auto"/>
-        <w:ind/>
-        <w:jc w:val="center"/>
-        <w:rPr>
-          <w:rFonts w:eastAsia="Times New Roman"/>
-          <w:b/>
-          <w:bCs/>
-          <w:color w:val="ff0000"/>
-          <w:sz w:val="24"/>
-          <w:szCs w:val="24"/>
-        </w:rPr>
-      </w:pPr>
-      <w:r>
-        <w:rPr>
-          <w:rFonts w:eastAsia="Times New Roman"/>
-          <w:b/>
-          <w:bCs/>
-          <w:color w:val="ff0000"/>
-          <w:sz w:val="24"/>
-          <w:szCs w:val="24"/>
-        </w:rPr>
-      </w:r>
-      <w:r>
-        <w:rPr>
-          <w:rFonts w:eastAsia="Times New Roman"/>
-          <w:b/>
-          <w:bCs/>
-          <w:color w:val="ff0000"/>
-          <w:sz w:val="24"/>
-          <w:szCs w:val="24"/>
-        </w:rPr>
-      </w:r>
-      <w:r>
-        <w:rPr>
-          <w:rFonts w:eastAsia="Times New Roman"/>
-          <w:b/>
-          <w:bCs/>
-          <w:color w:val="ff0000"/>
-          <w:sz w:val="24"/>
-          <w:szCs w:val="24"/>
-        </w:rPr>
-      </w:r>
-    </w:p>
-    <w:p>
-      <w:pPr>
-        <w:pStyle w:val="1117"/>
-        <w:pBdr/>
-        <w:spacing w:after="200" w:before="0" w:line="276" w:lineRule="auto"/>
-        <w:ind/>
-        <w:jc w:val="center"/>
+      <w:r>
         <w:rPr>
           <w:rFonts w:eastAsia="Times New Roman"/>
           <w:b/>
           <w:bCs/>
           <w:color w:val="ff0000"/>
           <w:lang w:val="en-US"/>
+        </w:rPr>
+      </w:r>
+      <w:r>
+        <w:rPr>
+          <w:rFonts w:eastAsia="Times New Roman"/>
+          <w:b/>
+          <w:bCs/>
+          <w:color w:val="ff0000"/>
+          <w:lang w:val="en-US"/>
+        </w:rPr>
+      </w:r>
+    </w:p>
+    <w:p>
+      <w:pPr>
+        <w:pStyle w:val="1117"/>
+        <w:pBdr/>
+        <w:spacing w:after="200" w:before="0" w:line="276" w:lineRule="auto"/>
+        <w:ind/>
+        <w:jc w:val="center"/>
+        <w:rPr>
+          <w:rFonts w:eastAsia="Times New Roman"/>
+          <w:b w:val="0"/>
+          <w:bCs w:val="0"/>
+          <w:color w:val="ff0000"/>
+          <w:sz w:val="24"/>
+          <w:szCs w:val="24"/>
+        </w:rPr>
+      </w:pPr>
+      <w:r>
+        <w:rPr>
+          <w:rFonts w:eastAsia="Times New Roman"/>
+          <w:b w:val="0"/>
+          <w:bCs w:val="0"/>
+          <w:color w:val="ff0000"/>
+          <w:sz w:val="24"/>
+          <w:szCs w:val="24"/>
+        </w:rPr>
+        <w:t xml:space="preserve">{nova_pagina}</w:t>
+      </w:r>
+      <w:r>
+        <w:rPr>
+          <w:rFonts w:eastAsia="Times New Roman"/>
+          <w:b w:val="0"/>
+          <w:bCs w:val="0"/>
+          <w:color w:val="ff0000"/>
+          <w:sz w:val="24"/>
+          <w:szCs w:val="24"/>
+        </w:rPr>
+      </w:r>
+      <w:r>
+        <w:rPr>
+          <w:rFonts w:eastAsia="Times New Roman"/>
+          <w:b w:val="0"/>
+          <w:bCs w:val="0"/>
+          <w:color w:val="ff0000"/>
+          <w:sz w:val="24"/>
+          <w:szCs w:val="24"/>
+        </w:rPr>
+      </w:r>
+    </w:p>
+    <w:p>
+      <w:pPr>
+        <w:pStyle w:val="1117"/>
+        <w:pBdr/>
+        <w:spacing w:after="200" w:before="0" w:line="276" w:lineRule="auto"/>
+        <w:ind/>
+        <w:jc w:val="center"/>
+        <w:rPr>
+          <w:rFonts w:eastAsia="Times New Roman"/>
+          <w:b w:val="0"/>
+          <w:bCs w:val="0"/>
+          <w:color w:val="ff0000"/>
+          <w:sz w:val="24"/>
+          <w:szCs w:val="24"/>
+        </w:rPr>
+      </w:pPr>
+      <w:r>
+        <w:rPr>
+          <w:rFonts w:eastAsia="Times New Roman"/>
+          <w:b w:val="0"/>
+          <w:bCs w:val="0"/>
+          <w:color w:val="ff0000"/>
+          <w:sz w:val="24"/>
+          <w:szCs w:val="24"/>
+        </w:rPr>
+      </w:r>
+      <w:r>
+        <w:rPr>
+          <w:rFonts w:eastAsia="Times New Roman"/>
+          <w:b w:val="0"/>
+          <w:bCs w:val="0"/>
+          <w:color w:val="ff0000"/>
+          <w:sz w:val="24"/>
+          <w:szCs w:val="24"/>
+        </w:rPr>
+      </w:r>
+      <w:r>
+        <w:rPr>
+          <w:rFonts w:eastAsia="Times New Roman"/>
+          <w:b w:val="0"/>
+          <w:bCs w:val="0"/>
+          <w:color w:val="ff0000"/>
+          <w:sz w:val="24"/>
+          <w:szCs w:val="24"/>
+        </w:rPr>
+      </w:r>
+    </w:p>
+    <w:p>
+      <w:pPr>
+        <w:pStyle w:val="1117"/>
+        <w:pBdr/>
+        <w:spacing w:after="200" w:before="0" w:line="276" w:lineRule="auto"/>
+        <w:ind/>
+        <w:jc w:val="center"/>
+        <w:rPr>
+          <w:rFonts w:eastAsia="Times New Roman"/>
+          <w:b w:val="0"/>
+          <w:bCs w:val="0"/>
+          <w:color w:val="ff0000"/>
         </w:rPr>
         <w:sectPr>
           <w:headerReference w:type="default" r:id="rId9"/>
@@ -7236,8 +7112,8 @@
       <w:r>
         <w:rPr>
           <w:rFonts w:eastAsia="Times New Roman"/>
-          <w:b/>
-          <w:bCs/>
+          <w:b w:val="0"/>
+          <w:bCs w:val="0"/>
           <w:color w:val="ff0000"/>
           <w:sz w:val="24"/>
           <w:szCs w:val="24"/>
@@ -7247,8 +7123,8 @@
       <w:r>
         <w:rPr>
           <w:rFonts w:eastAsia="Times New Roman"/>
-          <w:b/>
-          <w:bCs/>
+          <w:b w:val="0"/>
+          <w:bCs w:val="0"/>
           <w:color w:val="ff0000"/>
           <w:lang w:val="en-US"/>
         </w:rPr>
@@ -7256,8 +7132,8 @@
       <w:r>
         <w:rPr>
           <w:rFonts w:eastAsia="Times New Roman"/>
-          <w:b/>
-          <w:bCs/>
+          <w:b w:val="0"/>
+          <w:bCs w:val="0"/>
           <w:color w:val="ff0000"/>
           <w:lang w:val="en-US"/>
         </w:rPr>
@@ -7276,178 +7152,194 @@
         <w:jc w:val="center"/>
         <w:rPr>
           <w:rFonts w:eastAsia="Times New Roman"/>
+          <w:b w:val="0"/>
+          <w:bCs w:val="0"/>
+          <w:color w:val="ff0000"/>
+          <w:sz w:val="24"/>
+          <w:szCs w:val="24"/>
+        </w:rPr>
+      </w:pPr>
+      <w:r>
+        <w:rPr>
+          <w:rFonts w:eastAsia="Times New Roman"/>
+          <w:b w:val="0"/>
+          <w:bCs w:val="0"/>
+          <w:color w:val="ff0000"/>
+          <w:sz w:val="24"/>
+          <w:szCs w:val="24"/>
+        </w:rPr>
+        <w:t xml:space="preserve">{nova_pagina}</w:t>
+      </w:r>
+      <w:r>
+        <w:rPr>
+          <w:rFonts w:eastAsia="Times New Roman"/>
+          <w:b w:val="0"/>
+          <w:bCs w:val="0"/>
+          <w:color w:val="ff0000"/>
+          <w:sz w:val="24"/>
+          <w:szCs w:val="24"/>
+        </w:rPr>
+      </w:r>
+      <w:r>
+        <w:rPr>
+          <w:rFonts w:eastAsia="Times New Roman"/>
+          <w:b w:val="0"/>
+          <w:bCs w:val="0"/>
+          <w:color w:val="ff0000"/>
+          <w:sz w:val="24"/>
+          <w:szCs w:val="24"/>
+        </w:rPr>
+      </w:r>
+    </w:p>
+    <w:p>
+      <w:pPr>
+        <w:pStyle w:val="1117"/>
+        <w:pBdr/>
+        <w:spacing/>
+        <w:ind/>
+        <w:jc w:val="center"/>
+        <w:rPr>
+          <w:rFonts w:eastAsia="Times New Roman"/>
+          <w:b/>
+          <w:bCs/>
+          <w:sz w:val="24"/>
+          <w:szCs w:val="24"/>
+        </w:rPr>
+      </w:pPr>
+      <w:r>
+        <w:rPr>
+          <w:rFonts w:eastAsia="Times New Roman"/>
+          <w:b/>
+          <w:bCs/>
+          <w:sz w:val="24"/>
+          <w:szCs w:val="24"/>
+        </w:rPr>
+      </w:r>
+      <w:r>
+        <w:rPr>
+          <w:rFonts w:eastAsia="Times New Roman"/>
+          <w:b/>
+          <w:bCs/>
+          <w:sz w:val="24"/>
+          <w:szCs w:val="24"/>
+        </w:rPr>
+      </w:r>
+      <w:r>
+        <w:rPr>
+          <w:rFonts w:eastAsia="Times New Roman"/>
+          <w:b/>
+          <w:bCs/>
+          <w:sz w:val="24"/>
+          <w:szCs w:val="24"/>
+        </w:rPr>
+      </w:r>
+    </w:p>
+    <w:p>
+      <w:pPr>
+        <w:pStyle w:val="1117"/>
+        <w:pBdr/>
+        <w:spacing/>
+        <w:ind/>
+        <w:jc w:val="center"/>
+        <w:rPr>
+          <w:sz w:val="24"/>
+          <w:szCs w:val="24"/>
+        </w:rPr>
+      </w:pPr>
+      <w:r>
+        <w:rPr>
+          <w:rFonts w:eastAsia="Times New Roman"/>
+          <w:b/>
+          <w:bCs/>
+          <w:sz w:val="24"/>
+          <w:szCs w:val="24"/>
+        </w:rPr>
+        <w:t xml:space="preserve">CIENTE DO MILITAR ARROLADO                         </w:t>
+      </w:r>
+      <w:r>
+        <w:rPr>
+          <w:sz w:val="24"/>
+          <w:szCs w:val="24"/>
+        </w:rPr>
+      </w:r>
+      <w:r>
+        <w:rPr>
+          <w:sz w:val="24"/>
+          <w:szCs w:val="24"/>
+        </w:rPr>
+      </w:r>
+    </w:p>
+    <w:p>
+      <w:pPr>
+        <w:pStyle w:val="1117"/>
+        <w:pBdr/>
+        <w:spacing w:line="377" w:lineRule="exact"/>
+        <w:ind/>
+        <w:rPr>
+          <w:sz w:val="24"/>
+          <w:szCs w:val="24"/>
+        </w:rPr>
+      </w:pPr>
+      <w:r>
+        <w:rPr>
+          <w:sz w:val="24"/>
+          <w:szCs w:val="24"/>
+        </w:rPr>
+      </w:r>
+      <w:r>
+        <w:rPr>
+          <w:sz w:val="24"/>
+          <w:szCs w:val="24"/>
+        </w:rPr>
+      </w:r>
+      <w:r>
+        <w:rPr>
+          <w:sz w:val="24"/>
+          <w:szCs w:val="24"/>
+        </w:rPr>
+      </w:r>
+    </w:p>
+    <w:p>
+      <w:pPr>
+        <w:pStyle w:val="1117"/>
+        <w:pBdr/>
+        <w:spacing/>
+        <w:ind/>
+        <w:rPr>
+          <w:color w:val="ff0000"/>
+        </w:rPr>
+      </w:pPr>
+      <w:r>
+        <w:rPr>
+          <w:rFonts w:eastAsia="Times New Roman"/>
+          <w:sz w:val="24"/>
+          <w:szCs w:val="24"/>
+        </w:rPr>
+        <w:t xml:space="preserve">Eu</w:t>
+      </w:r>
+      <w:r>
+        <w:rPr>
+          <w:color w:val="ff0000"/>
+          <w:sz w:val="24"/>
+          <w:szCs w:val="24"/>
+        </w:rPr>
+        <w:t xml:space="preserve"> </w:t>
+      </w:r>
+      <w:r>
+        <w:rPr>
+          <w:b w:val="0"/>
+          <w:bCs w:val="0"/>
+          <w:color w:val="ff0000"/>
+        </w:rPr>
+        <w:t xml:space="preserve">{Militar Arrolado}</w:t>
+      </w:r>
+      <w:r>
+        <w:rPr>
           <w:b/>
           <w:bCs/>
           <w:color w:val="ff0000"/>
-          <w:sz w:val="24"/>
-          <w:szCs w:val="24"/>
-        </w:rPr>
-      </w:pPr>
-      <w:r>
-        <w:rPr>
-          <w:rFonts w:eastAsia="Times New Roman"/>
-          <w:b/>
-          <w:bCs/>
-          <w:color w:val="ff0000"/>
-          <w:sz w:val="24"/>
-          <w:szCs w:val="24"/>
-        </w:rPr>
-        <w:t xml:space="preserve">{nova_pagina}</w:t>
-      </w:r>
-      <w:r>
-        <w:rPr>
-          <w:rFonts w:eastAsia="Times New Roman"/>
-          <w:b/>
-          <w:bCs/>
-          <w:color w:val="ff0000"/>
-          <w:sz w:val="24"/>
-          <w:szCs w:val="24"/>
-        </w:rPr>
-      </w:r>
-      <w:r>
-        <w:rPr>
-          <w:rFonts w:eastAsia="Times New Roman"/>
-          <w:b/>
-          <w:bCs/>
-          <w:color w:val="ff0000"/>
-          <w:sz w:val="24"/>
-          <w:szCs w:val="24"/>
-        </w:rPr>
-      </w:r>
-    </w:p>
-    <w:p>
-      <w:pPr>
-        <w:pStyle w:val="1117"/>
-        <w:pBdr/>
-        <w:spacing/>
-        <w:ind/>
-        <w:jc w:val="center"/>
-        <w:rPr>
-          <w:rFonts w:eastAsia="Times New Roman"/>
-          <w:b/>
-          <w:bCs/>
-          <w:sz w:val="24"/>
-          <w:szCs w:val="24"/>
-        </w:rPr>
-      </w:pPr>
-      <w:r>
-        <w:rPr>
-          <w:rFonts w:eastAsia="Times New Roman"/>
-          <w:b/>
-          <w:bCs/>
-          <w:sz w:val="24"/>
-          <w:szCs w:val="24"/>
-        </w:rPr>
-      </w:r>
-      <w:r>
-        <w:rPr>
-          <w:rFonts w:eastAsia="Times New Roman"/>
-          <w:b/>
-          <w:bCs/>
-          <w:sz w:val="24"/>
-          <w:szCs w:val="24"/>
-        </w:rPr>
-      </w:r>
-      <w:r>
-        <w:rPr>
-          <w:rFonts w:eastAsia="Times New Roman"/>
-          <w:b/>
-          <w:bCs/>
-          <w:sz w:val="24"/>
-          <w:szCs w:val="24"/>
-        </w:rPr>
-      </w:r>
-    </w:p>
-    <w:p>
-      <w:pPr>
-        <w:pStyle w:val="1117"/>
-        <w:pBdr/>
-        <w:spacing/>
-        <w:ind/>
-        <w:jc w:val="center"/>
-        <w:rPr>
-          <w:sz w:val="24"/>
-          <w:szCs w:val="24"/>
-        </w:rPr>
-      </w:pPr>
-      <w:r>
-        <w:rPr>
-          <w:rFonts w:eastAsia="Times New Roman"/>
-          <w:b/>
-          <w:bCs/>
-          <w:sz w:val="24"/>
-          <w:szCs w:val="24"/>
-        </w:rPr>
-        <w:t xml:space="preserve">CIENTE DO MILITAR ARROLADO                         </w:t>
-      </w:r>
-      <w:r>
-        <w:rPr>
-          <w:sz w:val="24"/>
-          <w:szCs w:val="24"/>
-        </w:rPr>
-      </w:r>
-      <w:r>
-        <w:rPr>
-          <w:sz w:val="24"/>
-          <w:szCs w:val="24"/>
-        </w:rPr>
-      </w:r>
-    </w:p>
-    <w:p>
-      <w:pPr>
-        <w:pStyle w:val="1117"/>
-        <w:pBdr/>
-        <w:spacing w:line="377" w:lineRule="exact"/>
-        <w:ind/>
-        <w:rPr>
-          <w:sz w:val="24"/>
-          <w:szCs w:val="24"/>
-        </w:rPr>
-      </w:pPr>
-      <w:r>
-        <w:rPr>
-          <w:sz w:val="24"/>
-          <w:szCs w:val="24"/>
-        </w:rPr>
-      </w:r>
-      <w:r>
-        <w:rPr>
-          <w:sz w:val="24"/>
-          <w:szCs w:val="24"/>
-        </w:rPr>
-      </w:r>
-      <w:r>
-        <w:rPr>
-          <w:sz w:val="24"/>
-          <w:szCs w:val="24"/>
-        </w:rPr>
-      </w:r>
-    </w:p>
-    <w:p>
-      <w:pPr>
-        <w:pStyle w:val="1117"/>
-        <w:pBdr/>
-        <w:spacing/>
-        <w:ind/>
-        <w:rPr>
-          <w:color w:val="ff0000"/>
-        </w:rPr>
-      </w:pPr>
-      <w:r>
-        <w:rPr>
-          <w:rFonts w:eastAsia="Times New Roman"/>
-          <w:sz w:val="24"/>
-          <w:szCs w:val="24"/>
-        </w:rPr>
-        <w:t xml:space="preserve">Eu</w:t>
-      </w:r>
-      <w:r>
-        <w:rPr>
-          <w:color w:val="ff0000"/>
-          <w:sz w:val="24"/>
-          <w:szCs w:val="24"/>
-        </w:rPr>
-        <w:t xml:space="preserve"> </w:t>
+        </w:rPr>
+        <w:t xml:space="preserve">, </w:t>
       </w:r>
       <w:r>
         <w:rPr>
@@ -7455,22 +7347,6 @@
           <w:bCs w:val="0"/>
           <w:color w:val="ff0000"/>
         </w:rPr>
-        <w:t xml:space="preserve">{Militar Arrolado}</w:t>
-      </w:r>
-      <w:r>
-        <w:rPr>
-          <w:b/>
-          <w:bCs/>
-          <w:color w:val="ff0000"/>
-        </w:rPr>
-        <w:t xml:space="preserve">, </w:t>
-      </w:r>
-      <w:r>
-        <w:rPr>
-          <w:b w:val="0"/>
-          <w:bCs w:val="0"/>
-          <w:color w:val="ff0000"/>
-        </w:rPr>
         <w:t xml:space="preserve">{Saram Militar Arrolado}</w:t>
       </w:r>
       <w:r>
@@ -7546,8 +7422,6 @@
       </w:r>
       <w:r>
         <w:rPr>
-          <w:b w:val="0"/>
-          <w:bCs w:val="0"/>
           <w:color w:val="ff0000"/>
         </w:rPr>
       </w:r>

</xml_diff>

<commit_message>
Ouvidoria- documento exportado consertado
</commit_message>
<xml_diff>
--- a/GsdAutomatico/pdf/PATD_Coringa.docx
+++ b/GsdAutomatico/pdf/PATD_Coringa.docx
@@ -4406,6 +4406,41 @@
     </w:p>
     <w:p>
       <w:pPr>
+        <w:pStyle w:val="1141"/>
+        <w:pBdr/>
+        <w:spacing/>
+        <w:ind/>
+        <w:jc w:val="right"/>
+        <w:rPr>
+          <w:rFonts w:eastAsia="Times New Roman"/>
+          <w:b/>
+          <w:bCs/>
+        </w:rPr>
+      </w:pPr>
+      <w:r>
+        <w:rPr>
+          <w:rFonts w:eastAsia="Times New Roman"/>
+          <w:b/>
+          <w:bCs/>
+        </w:rPr>
+      </w:r>
+      <w:r>
+        <w:rPr>
+          <w:rFonts w:eastAsia="Times New Roman"/>
+          <w:b/>
+          <w:bCs/>
+        </w:rPr>
+      </w:r>
+      <w:r>
+        <w:rPr>
+          <w:rFonts w:eastAsia="Times New Roman"/>
+          <w:b/>
+          <w:bCs/>
+        </w:rPr>
+      </w:r>
+    </w:p>
+    <w:p>
+      <w:pPr>
         <w:pStyle w:val="1117"/>
         <w:pBdr/>
         <w:spacing/>
@@ -4413,6 +4448,11 @@
         <w:jc w:val="right"/>
         <w:rPr>
           <w:rFonts w:eastAsia="Times New Roman"/>
+          <w:b/>
+          <w:bCs/>
+          <w:color w:val="ff0000"/>
+          <w:highlight w:val="none"/>
+          <w:lang w:val="en-US"/>
         </w:rPr>
       </w:pPr>
       <w:r>
@@ -4465,40 +4505,32 @@
       <w:r>
         <w:rPr>
           <w:rFonts w:eastAsia="Times New Roman"/>
-        </w:rPr>
-      </w:r>
-    </w:p>
-    <w:p>
-      <w:pPr>
-        <w:pStyle w:val="1117"/>
-        <w:pBdr/>
-        <w:tabs>
-          <w:tab w:val="clear" w:leader="none" w:pos="708"/>
-          <w:tab w:val="left" w:leader="none" w:pos="7033"/>
-        </w:tabs>
-        <w:spacing/>
-        <w:ind/>
+          <w:b/>
+          <w:bCs/>
+          <w:color w:val="ff0000"/>
+          <w:highlight w:val="none"/>
+          <w:lang w:val="en-US"/>
+        </w:rPr>
+      </w:r>
+      <w:r>
         <w:rPr>
           <w:rFonts w:eastAsia="Times New Roman"/>
           <w:b/>
           <w:bCs/>
           <w:color w:val="ff0000"/>
-          <w:sz w:val="24"/>
-          <w:szCs w:val="24"/>
-        </w:rPr>
-      </w:pPr>
+          <w:highlight w:val="none"/>
+          <w:lang w:val="en-US"/>
+        </w:rPr>
+      </w:r>
       <w:r>
         <w:rPr>
           <w:rFonts w:eastAsia="Times New Roman"/>
           <w:b/>
           <w:bCs/>
           <w:color w:val="ff0000"/>
-          <w:sz w:val="24"/>
-          <w:szCs w:val="24"/>
-        </w:rPr>
-      </w:r>
-      <w:r>
-        <w:br w:type="page" w:clear="all"/>
+          <w:highlight w:val="none"/>
+          <w:lang w:val="en-US"/>
+        </w:rPr>
       </w:r>
       <w:r>
         <w:rPr>
@@ -4506,18 +4538,8 @@
           <w:b/>
           <w:bCs/>
           <w:color w:val="ff0000"/>
-          <w:sz w:val="24"/>
-          <w:szCs w:val="24"/>
-        </w:rPr>
-      </w:r>
-      <w:r>
-        <w:rPr>
-          <w:rFonts w:eastAsia="Times New Roman"/>
-          <w:b/>
-          <w:bCs/>
-          <w:color w:val="ff0000"/>
-          <w:sz w:val="24"/>
-          <w:szCs w:val="24"/>
+          <w:highlight w:val="none"/>
+          <w:lang w:val="en-US"/>
         </w:rPr>
       </w:r>
     </w:p>
@@ -4533,20 +4555,34 @@
         <w:spacing w:after="0" w:before="0"/>
         <w:ind/>
         <w:jc w:val="center"/>
-        <w:rPr/>
+        <w:rPr>
+          <w:b w:val="0"/>
+          <w:bCs w:val="0"/>
+        </w:rPr>
       </w:pPr>
       <w:r>
         <w:rPr>
           <w:rFonts w:eastAsia="Times New Roman"/>
-          <w:b/>
-          <w:bCs/>
+          <w:b w:val="0"/>
+          <w:bCs w:val="0"/>
           <w:color w:val="ff0000"/>
           <w:sz w:val="24"/>
           <w:szCs w:val="24"/>
         </w:rPr>
         <w:t xml:space="preserve">{nova_pagina}</w:t>
       </w:r>
-      <w:r/>
+      <w:r>
+        <w:rPr>
+          <w:b w:val="0"/>
+          <w:bCs w:val="0"/>
+        </w:rPr>
+      </w:r>
+      <w:r>
+        <w:rPr>
+          <w:b w:val="0"/>
+          <w:bCs w:val="0"/>
+        </w:rPr>
+      </w:r>
     </w:p>
     <w:p>
       <w:pPr>
@@ -5431,6 +5467,7 @@
           <w:b/>
           <w:bCs/>
           <w:color w:val="ff0000"/>
+          <w:highlight w:val="none"/>
         </w:rPr>
       </w:r>
       <w:r>
@@ -5472,7 +5509,6 @@
           <w:b/>
           <w:bCs/>
           <w:color w:val="ff0000"/>
-          <w:highlight w:val="none"/>
         </w:rPr>
       </w:r>
       <w:r>
@@ -5514,6 +5550,7 @@
           <w:b w:val="0"/>
           <w:bCs w:val="0"/>
           <w:color w:val="ff0000"/>
+          <w:highlight w:val="none"/>
         </w:rPr>
       </w:r>
       <w:r>
@@ -5555,7 +5592,6 @@
           <w:b w:val="0"/>
           <w:bCs w:val="0"/>
           <w:color w:val="ff0000"/>
-          <w:highlight w:val="none"/>
         </w:rPr>
       </w:r>
       <w:r>
@@ -5789,6 +5825,7 @@
       <w:r>
         <w:rPr>
           <w:color w:val="ff0000"/>
+          <w:highlight w:val="none"/>
         </w:rPr>
       </w:r>
       <w:r>
@@ -5822,7 +5859,6 @@
       <w:r>
         <w:rPr>
           <w:color w:val="ff0000"/>
-          <w:highlight w:val="none"/>
         </w:rPr>
       </w:r>
       <w:r>
@@ -6797,6 +6833,14 @@
           <w:szCs w:val="24"/>
         </w:rPr>
       </w:r>
+      <w:r>
+        <w:rPr>
+          <w:rFonts w:eastAsia="Times New Roman"/>
+          <w:color w:val="1c1c1c"/>
+          <w:sz w:val="24"/>
+          <w:szCs w:val="24"/>
+        </w:rPr>
+      </w:r>
     </w:p>
     <w:p>
       <w:pPr>
@@ -6876,15 +6920,6 @@
       <w:r>
         <w:rPr>
           <w:rFonts w:eastAsia="Times New Roman"/>
-          <w:b/>
-          <w:bCs/>
-          <w:color w:val="ff0000"/>
-          <w:lang w:val="en-US"/>
-        </w:rPr>
-      </w:r>
-      <w:r>
-        <w:rPr>
-          <w:rFonts w:eastAsia="Times New Roman"/>
           <w:sz w:val="24"/>
           <w:szCs w:val="24"/>
         </w:rPr>
@@ -6924,7 +6959,6 @@
         </w:rPr>
         <w:t xml:space="preserve">/BAGL-GSDGL/{DataPatd}</w:t>
       </w:r>
-      <w:r/>
       <w:r>
         <w:rPr>
           <w:rFonts w:eastAsia="Times New Roman"/>
@@ -7126,7 +7160,6 @@
           <w:b w:val="0"/>
           <w:bCs w:val="0"/>
           <w:color w:val="ff0000"/>
-          <w:lang w:val="en-US"/>
         </w:rPr>
       </w:r>
       <w:r>
@@ -7135,7 +7168,6 @@
           <w:b w:val="0"/>
           <w:bCs w:val="0"/>
           <w:color w:val="ff0000"/>
-          <w:lang w:val="en-US"/>
         </w:rPr>
       </w:r>
     </w:p>

</xml_diff>